<commit_message>
docs: add requirements specification and escalation paths
- DOC-02 Requirements Specification (Markdown and Word): roles and permissions, scenarios, review and exception categories, parameters, 81 functional and 11 non-functional requirements, business and control rules, report catalog, escalation paths, deliberate no-ops, traceability to brief sections 1-16
- Escalation paths diagram (Mermaid source and PNG), paths ESC-01..05
- DOC-01: compact layout; document-control and approval blocks removed
- README: DOC-02 added to documents table
</commit_message>
<xml_diff>
--- a/docs/word-files/01_project_proposal.docx
+++ b/docs/word-files/01_project_proposal.docx
@@ -2,261 +2,13 @@
 <file path=word/document.xml><?xml version="1.0" encoding="utf-8"?>
 <w:document xmlns:w="http://schemas.openxmlformats.org/wordprocessingml/2006/main" xmlns:m="http://schemas.openxmlformats.org/officeDocument/2006/math" xmlns:r="http://schemas.openxmlformats.org/officeDocument/2006/relationships" xmlns:o="urn:schemas-microsoft-com:office:office" xmlns:v="urn:schemas-microsoft-com:vml" xmlns:w10="urn:schemas-microsoft-com:office:word" xmlns:a="http://schemas.openxmlformats.org/drawingml/2006/main" xmlns:pic="http://schemas.openxmlformats.org/drawingml/2006/picture" xmlns:wp="http://schemas.openxmlformats.org/drawingml/2006/wordprocessingDrawing">
   <w:body>
-    <w:bookmarkStart w:id="44" w:name="X5249c99f8e807a2920bef3de016e3f349640f20"/>
+    <w:bookmarkStart w:id="43" w:name="X5249c99f8e807a2920bef3de016e3f349640f20"/>
     <w:p>
       <w:pPr>
         <w:pStyle w:val="Heading1"/>
       </w:pPr>
       <w:r>
         <w:t xml:space="preserve">Project Proposal — AI-Assisted Bank Reconciliation</w:t>
-      </w:r>
-    </w:p>
-    <w:tbl>
-      <w:tblPr>
-        <w:tblStyle w:val="Table"/>
-        <w:tblW w:type="pct" w:w="5000"/>
-        <w:tblLook w:firstRow="1" w:lastRow="0" w:firstColumn="0" w:lastColumn="0" w:noHBand="0" w:noVBand="0" w:val="0020"/>
-        <w:jc w:val="start"/>
-      </w:tblPr>
-      <w:tblGrid>
-        <w:gridCol w:w="3960"/>
-        <w:gridCol w:w="3960"/>
-      </w:tblGrid>
-      <w:tr>
-        <w:trPr>
-          <w:tblHeader w:val="true"/>
-        </w:trPr>
-        <w:tc>
-          <w:tcPr/>
-          <w:p>
-            <w:pPr>
-              <w:pStyle w:val="Compact"/>
-              <w:jc w:val="left"/>
-            </w:pPr>
-            <w:r>
-              <w:t xml:space="preserve">Field</w:t>
-            </w:r>
-          </w:p>
-        </w:tc>
-        <w:tc>
-          <w:tcPr/>
-          <w:p>
-            <w:pPr>
-              <w:pStyle w:val="Compact"/>
-              <w:jc w:val="left"/>
-            </w:pPr>
-            <w:r>
-              <w:t xml:space="preserve">Value</w:t>
-            </w:r>
-          </w:p>
-        </w:tc>
-      </w:tr>
-      <w:tr>
-        <w:tc>
-          <w:tcPr/>
-          <w:p>
-            <w:pPr>
-              <w:pStyle w:val="Compact"/>
-              <w:jc w:val="left"/>
-            </w:pPr>
-            <w:r>
-              <w:t xml:space="preserve">Document ID</w:t>
-            </w:r>
-          </w:p>
-        </w:tc>
-        <w:tc>
-          <w:tcPr/>
-          <w:p>
-            <w:pPr>
-              <w:pStyle w:val="Compact"/>
-              <w:jc w:val="left"/>
-            </w:pPr>
-            <w:r>
-              <w:t xml:space="preserve">DOC-01</w:t>
-            </w:r>
-          </w:p>
-        </w:tc>
-      </w:tr>
-      <w:tr>
-        <w:tc>
-          <w:tcPr/>
-          <w:p>
-            <w:pPr>
-              <w:pStyle w:val="Compact"/>
-              <w:jc w:val="left"/>
-            </w:pPr>
-            <w:r>
-              <w:t xml:space="preserve">Version</w:t>
-            </w:r>
-          </w:p>
-        </w:tc>
-        <w:tc>
-          <w:tcPr/>
-          <w:p>
-            <w:pPr>
-              <w:pStyle w:val="Compact"/>
-              <w:jc w:val="left"/>
-            </w:pPr>
-            <w:r>
-              <w:t xml:space="preserve">0.1 (Draft for sponsor review)</w:t>
-            </w:r>
-          </w:p>
-        </w:tc>
-      </w:tr>
-      <w:tr>
-        <w:tc>
-          <w:tcPr/>
-          <w:p>
-            <w:pPr>
-              <w:pStyle w:val="Compact"/>
-              <w:jc w:val="left"/>
-            </w:pPr>
-            <w:r>
-              <w:t xml:space="preserve">Date</w:t>
-            </w:r>
-          </w:p>
-        </w:tc>
-        <w:tc>
-          <w:tcPr/>
-          <w:p>
-            <w:pPr>
-              <w:pStyle w:val="Compact"/>
-              <w:jc w:val="left"/>
-            </w:pPr>
-            <w:r>
-              <w:t xml:space="preserve">2026-09-21</w:t>
-            </w:r>
-          </w:p>
-        </w:tc>
-      </w:tr>
-      <w:tr>
-        <w:tc>
-          <w:tcPr/>
-          <w:p>
-            <w:pPr>
-              <w:pStyle w:val="Compact"/>
-              <w:jc w:val="left"/>
-            </w:pPr>
-            <w:r>
-              <w:t xml:space="preserve">Owner</w:t>
-            </w:r>
-          </w:p>
-        </w:tc>
-        <w:tc>
-          <w:tcPr/>
-          <w:p>
-            <w:pPr>
-              <w:pStyle w:val="Compact"/>
-              <w:jc w:val="left"/>
-            </w:pPr>
-            <w:r>
-              <w:t xml:space="preserve">Uday Gunturu, Lead Analyst and Developer</w:t>
-            </w:r>
-          </w:p>
-        </w:tc>
-      </w:tr>
-      <w:tr>
-        <w:tc>
-          <w:tcPr/>
-          <w:p>
-            <w:pPr>
-              <w:pStyle w:val="Compact"/>
-              <w:jc w:val="left"/>
-            </w:pPr>
-            <w:r>
-              <w:t xml:space="preserve">Approver</w:t>
-            </w:r>
-          </w:p>
-        </w:tc>
-        <w:tc>
-          <w:tcPr/>
-          <w:p>
-            <w:pPr>
-              <w:pStyle w:val="Compact"/>
-              <w:jc w:val="left"/>
-            </w:pPr>
-            <w:r>
-              <w:t xml:space="preserve">Project Sponsor</w:t>
-            </w:r>
-          </w:p>
-        </w:tc>
-      </w:tr>
-      <w:tr>
-        <w:tc>
-          <w:tcPr/>
-          <w:p>
-            <w:pPr>
-              <w:pStyle w:val="Compact"/>
-              <w:jc w:val="left"/>
-            </w:pPr>
-            <w:r>
-              <w:t xml:space="preserve">Status</w:t>
-            </w:r>
-          </w:p>
-        </w:tc>
-        <w:tc>
-          <w:tcPr/>
-          <w:p>
-            <w:pPr>
-              <w:pStyle w:val="Compact"/>
-              <w:jc w:val="left"/>
-            </w:pPr>
-            <w:r>
-              <w:t xml:space="preserve">Draft</w:t>
-            </w:r>
-          </w:p>
-        </w:tc>
-      </w:tr>
-      <w:tr>
-        <w:tc>
-          <w:tcPr/>
-          <w:p>
-            <w:pPr>
-              <w:pStyle w:val="Compact"/>
-              <w:jc w:val="left"/>
-            </w:pPr>
-            <w:r>
-              <w:t xml:space="preserve">Related documents</w:t>
-            </w:r>
-          </w:p>
-        </w:tc>
-        <w:tc>
-          <w:tcPr/>
-          <w:p>
-            <w:pPr>
-              <w:pStyle w:val="Compact"/>
-              <w:jc w:val="left"/>
-            </w:pPr>
-            <w:r>
-              <w:t xml:space="preserve">DOC-02 Requirements Specification (planned), DOC-05 System Design (planned)</w:t>
-            </w:r>
-          </w:p>
-        </w:tc>
-      </w:tr>
-    </w:tbl>
-    <w:p>
-      <w:pPr>
-        <w:pStyle w:val="BlockText"/>
-      </w:pPr>
-      <w:r>
-        <w:rPr>
-          <w:bCs/>
-          <w:b/>
-        </w:rPr>
-        <w:t xml:space="preserve">Project principle:</w:t>
-      </w:r>
-      <w:r>
-        <w:t xml:space="preserve"> </w:t>
-      </w:r>
-      <w:r>
-        <w:t xml:space="preserve">AI recommends. Humans authorize. The system documents both.</w:t>
-      </w:r>
-    </w:p>
-    <w:p>
-      <w:r>
-        <w:pict>
-          <v:rect style="width:0;height:1.5pt" o:hralign="center" o:hrstd="t" o:hr="t"/>
-        </w:pict>
       </w:r>
     </w:p>
     <w:bookmarkStart w:id="20" w:name="purpose"/>
@@ -294,8 +46,8 @@
         <w:jc w:val="start"/>
       </w:tblPr>
       <w:tblGrid>
-        <w:gridCol w:w="3960"/>
-        <w:gridCol w:w="3960"/>
+        <w:gridCol w:w="1662"/>
+        <w:gridCol w:w="6257"/>
       </w:tblGrid>
       <w:tr>
         <w:trPr>
@@ -587,9 +339,9 @@
         <w:jc w:val="start"/>
       </w:tblPr>
       <w:tblGrid>
-        <w:gridCol w:w="2640"/>
-        <w:gridCol w:w="2640"/>
-        <w:gridCol w:w="2640"/>
+        <w:gridCol w:w="838"/>
+        <w:gridCol w:w="2608"/>
+        <w:gridCol w:w="4472"/>
       </w:tblGrid>
       <w:tr>
         <w:trPr>
@@ -873,9 +625,9 @@
         <w:jc w:val="start"/>
       </w:tblPr>
       <w:tblGrid>
-        <w:gridCol w:w="2640"/>
-        <w:gridCol w:w="2640"/>
-        <w:gridCol w:w="2640"/>
+        <w:gridCol w:w="720"/>
+        <w:gridCol w:w="1620"/>
+        <w:gridCol w:w="5580"/>
       </w:tblGrid>
       <w:tr>
         <w:trPr>
@@ -1342,10 +1094,10 @@
         <w:jc w:val="start"/>
       </w:tblPr>
       <w:tblGrid>
-        <w:gridCol w:w="1980"/>
-        <w:gridCol w:w="1980"/>
-        <w:gridCol w:w="1980"/>
-        <w:gridCol w:w="1980"/>
+        <w:gridCol w:w="1131"/>
+        <w:gridCol w:w="1479"/>
+        <w:gridCol w:w="2001"/>
+        <w:gridCol w:w="3307"/>
       </w:tblGrid>
       <w:tr>
         <w:trPr>
@@ -1719,9 +1471,9 @@
         <w:jc w:val="start"/>
       </w:tblPr>
       <w:tblGrid>
-        <w:gridCol w:w="2640"/>
-        <w:gridCol w:w="2640"/>
-        <w:gridCol w:w="2640"/>
+        <w:gridCol w:w="1485"/>
+        <w:gridCol w:w="990"/>
+        <w:gridCol w:w="5445"/>
       </w:tblGrid>
       <w:tr>
         <w:trPr>
@@ -1869,8 +1621,8 @@
         <w:jc w:val="start"/>
       </w:tblPr>
       <w:tblGrid>
-        <w:gridCol w:w="3960"/>
-        <w:gridCol w:w="3960"/>
+        <w:gridCol w:w="1677"/>
+        <w:gridCol w:w="6242"/>
       </w:tblGrid>
       <w:tr>
         <w:trPr>
@@ -2206,8 +1958,8 @@
         <w:jc w:val="start"/>
       </w:tblPr>
       <w:tblGrid>
-        <w:gridCol w:w="3960"/>
-        <w:gridCol w:w="3960"/>
+        <w:gridCol w:w="2772"/>
+        <w:gridCol w:w="5148"/>
       </w:tblGrid>
       <w:tr>
         <w:trPr>
@@ -2518,9 +2270,9 @@
         <w:jc w:val="start"/>
       </w:tblPr>
       <w:tblGrid>
-        <w:gridCol w:w="2640"/>
-        <w:gridCol w:w="2640"/>
-        <w:gridCol w:w="2640"/>
+        <w:gridCol w:w="1526"/>
+        <w:gridCol w:w="4007"/>
+        <w:gridCol w:w="2385"/>
       </w:tblGrid>
       <w:tr>
         <w:trPr>
@@ -2931,7 +2683,7 @@
       <w:r>
         <w:drawing>
           <wp:inline>
-            <wp:extent cx="5334000" cy="10227433"/>
+            <wp:extent cx="2956747" cy="5669280"/>
             <wp:effectExtent b="0" l="0" r="0" t="0"/>
             <wp:docPr descr="Current-state reconciliation process" title="" id="33" name="Picture"/>
             <a:graphic>
@@ -2952,7 +2704,7 @@
                   <pic:spPr bwMode="auto">
                     <a:xfrm>
                       <a:off x="0" y="0"/>
-                      <a:ext cx="5334000" cy="10227433"/>
+                      <a:ext cx="2956747" cy="5669280"/>
                     </a:xfrm>
                     <a:prstGeom prst="rect">
                       <a:avLst/>
@@ -2987,10 +2739,10 @@
         <w:jc w:val="start"/>
       </w:tblPr>
       <w:tblGrid>
-        <w:gridCol w:w="1980"/>
-        <w:gridCol w:w="1980"/>
-        <w:gridCol w:w="1980"/>
-        <w:gridCol w:w="1980"/>
+        <w:gridCol w:w="728"/>
+        <w:gridCol w:w="2640"/>
+        <w:gridCol w:w="1183"/>
+        <w:gridCol w:w="3368"/>
       </w:tblGrid>
       <w:tr>
         <w:trPr>
@@ -3514,8 +3266,8 @@
         <w:jc w:val="start"/>
       </w:tblPr>
       <w:tblGrid>
-        <w:gridCol w:w="3960"/>
-        <w:gridCol w:w="3960"/>
+        <w:gridCol w:w="869"/>
+        <w:gridCol w:w="7050"/>
       </w:tblGrid>
       <w:tr>
         <w:trPr>
@@ -3825,8 +3577,8 @@
         <w:jc w:val="start"/>
       </w:tblPr>
       <w:tblGrid>
-        <w:gridCol w:w="3960"/>
-        <w:gridCol w:w="3960"/>
+        <w:gridCol w:w="869"/>
+        <w:gridCol w:w="7050"/>
       </w:tblGrid>
       <w:tr>
         <w:trPr>
@@ -4014,11 +3766,11 @@
         <w:jc w:val="start"/>
       </w:tblPr>
       <w:tblGrid>
-        <w:gridCol w:w="1584"/>
-        <w:gridCol w:w="1584"/>
-        <w:gridCol w:w="1584"/>
-        <w:gridCol w:w="1584"/>
-        <w:gridCol w:w="1584"/>
+        <w:gridCol w:w="800"/>
+        <w:gridCol w:w="2669"/>
+        <w:gridCol w:w="355"/>
+        <w:gridCol w:w="355"/>
+        <w:gridCol w:w="3737"/>
       </w:tblGrid>
       <w:tr>
         <w:trPr>
@@ -4809,9 +4561,9 @@
         <w:jc w:val="start"/>
       </w:tblPr>
       <w:tblGrid>
-        <w:gridCol w:w="2640"/>
-        <w:gridCol w:w="2640"/>
-        <w:gridCol w:w="2640"/>
+        <w:gridCol w:w="745"/>
+        <w:gridCol w:w="6242"/>
+        <w:gridCol w:w="931"/>
       </w:tblGrid>
       <w:tr>
         <w:trPr>
@@ -5341,9 +5093,9 @@
         <w:jc w:val="start"/>
       </w:tblPr>
       <w:tblGrid>
-        <w:gridCol w:w="2640"/>
-        <w:gridCol w:w="2640"/>
-        <w:gridCol w:w="2640"/>
+        <w:gridCol w:w="1211"/>
+        <w:gridCol w:w="5031"/>
+        <w:gridCol w:w="1677"/>
       </w:tblGrid>
       <w:tr>
         <w:trPr>
@@ -5889,14 +5641,14 @@
     <w:tbl>
       <w:tblPr>
         <w:tblStyle w:val="Table"/>
-        <w:tblW w:type="auto" w:w="0"/>
+        <w:tblW w:type="pct" w:w="5000"/>
         <w:tblLook w:firstRow="1" w:lastRow="0" w:firstColumn="0" w:lastColumn="0" w:noHBand="0" w:noVBand="0" w:val="0020"/>
         <w:jc w:val="start"/>
       </w:tblPr>
       <w:tblGrid>
-        <w:gridCol w:w="2640"/>
-        <w:gridCol w:w="2640"/>
-        <w:gridCol w:w="2640"/>
+        <w:gridCol w:w="891"/>
+        <w:gridCol w:w="5049"/>
+        <w:gridCol w:w="1980"/>
       </w:tblGrid>
       <w:tr>
         <w:trPr>
@@ -6262,9 +6014,9 @@
         <w:jc w:val="start"/>
       </w:tblPr>
       <w:tblGrid>
-        <w:gridCol w:w="2640"/>
-        <w:gridCol w:w="2640"/>
-        <w:gridCol w:w="2640"/>
+        <w:gridCol w:w="858"/>
+        <w:gridCol w:w="2862"/>
+        <w:gridCol w:w="4198"/>
       </w:tblGrid>
       <w:tr>
         <w:trPr>
@@ -6537,173 +6289,11 @@
       </w:tr>
     </w:tbl>
     <w:bookmarkEnd w:id="42"/>
-    <w:bookmarkStart w:id="43" w:name="approval"/>
-    <w:p>
-      <w:pPr>
-        <w:pStyle w:val="Heading2"/>
-      </w:pPr>
-      <w:r>
-        <w:t xml:space="preserve">17. Approval</w:t>
-      </w:r>
-    </w:p>
-    <w:tbl>
-      <w:tblPr>
-        <w:tblStyle w:val="Table"/>
-        <w:tblW w:type="auto" w:w="0"/>
-        <w:tblLook w:firstRow="1" w:lastRow="0" w:firstColumn="0" w:lastColumn="0" w:noHBand="0" w:noVBand="0" w:val="0020"/>
-        <w:jc w:val="start"/>
-      </w:tblPr>
-      <w:tblGrid>
-        <w:gridCol w:w="1980"/>
-        <w:gridCol w:w="1980"/>
-        <w:gridCol w:w="1980"/>
-        <w:gridCol w:w="1980"/>
-      </w:tblGrid>
-      <w:tr>
-        <w:trPr>
-          <w:tblHeader w:val="true"/>
-        </w:trPr>
-        <w:tc>
-          <w:tcPr/>
-          <w:p>
-            <w:pPr>
-              <w:pStyle w:val="Compact"/>
-              <w:jc w:val="left"/>
-            </w:pPr>
-            <w:r>
-              <w:t xml:space="preserve">Role</w:t>
-            </w:r>
-          </w:p>
-        </w:tc>
-        <w:tc>
-          <w:tcPr/>
-          <w:p>
-            <w:pPr>
-              <w:pStyle w:val="Compact"/>
-              <w:jc w:val="left"/>
-            </w:pPr>
-            <w:r>
-              <w:t xml:space="preserve">Name</w:t>
-            </w:r>
-          </w:p>
-        </w:tc>
-        <w:tc>
-          <w:tcPr/>
-          <w:p>
-            <w:pPr>
-              <w:pStyle w:val="Compact"/>
-              <w:jc w:val="left"/>
-            </w:pPr>
-            <w:r>
-              <w:t xml:space="preserve">Decision</w:t>
-            </w:r>
-          </w:p>
-        </w:tc>
-        <w:tc>
-          <w:tcPr/>
-          <w:p>
-            <w:pPr>
-              <w:pStyle w:val="Compact"/>
-              <w:jc w:val="left"/>
-            </w:pPr>
-            <w:r>
-              <w:t xml:space="preserve">Date</w:t>
-            </w:r>
-          </w:p>
-        </w:tc>
-      </w:tr>
-      <w:tr>
-        <w:tc>
-          <w:tcPr/>
-          <w:p>
-            <w:pPr>
-              <w:pStyle w:val="Compact"/>
-              <w:jc w:val="left"/>
-            </w:pPr>
-            <w:r>
-              <w:t xml:space="preserve">Project Sponsor</w:t>
-            </w:r>
-          </w:p>
-        </w:tc>
-        <w:tc>
-          <w:tcPr/>
-          <w:p>
-            <w:pPr>
-              <w:pStyle w:val="Compact"/>
-            </w:pPr>
-          </w:p>
-        </w:tc>
-        <w:tc>
-          <w:tcPr/>
-          <w:p>
-            <w:pPr>
-              <w:pStyle w:val="Compact"/>
-            </w:pPr>
-          </w:p>
-        </w:tc>
-        <w:tc>
-          <w:tcPr/>
-          <w:p>
-            <w:pPr>
-              <w:pStyle w:val="Compact"/>
-            </w:pPr>
-          </w:p>
-        </w:tc>
-      </w:tr>
-      <w:tr>
-        <w:tc>
-          <w:tcPr/>
-          <w:p>
-            <w:pPr>
-              <w:pStyle w:val="Compact"/>
-              <w:jc w:val="left"/>
-            </w:pPr>
-            <w:r>
-              <w:t xml:space="preserve">Lead Analyst and Developer</w:t>
-            </w:r>
-          </w:p>
-        </w:tc>
-        <w:tc>
-          <w:tcPr/>
-          <w:p>
-            <w:pPr>
-              <w:pStyle w:val="Compact"/>
-              <w:jc w:val="left"/>
-            </w:pPr>
-            <w:r>
-              <w:t xml:space="preserve">Uday Gunturu</w:t>
-            </w:r>
-          </w:p>
-        </w:tc>
-        <w:tc>
-          <w:tcPr/>
-          <w:p>
-            <w:pPr>
-              <w:pStyle w:val="Compact"/>
-              <w:jc w:val="left"/>
-            </w:pPr>
-            <w:r>
-              <w:t xml:space="preserve">Submitted</w:t>
-            </w:r>
-          </w:p>
-        </w:tc>
-        <w:tc>
-          <w:tcPr/>
-          <w:p>
-            <w:pPr>
-              <w:pStyle w:val="Compact"/>
-              <w:jc w:val="left"/>
-            </w:pPr>
-            <w:r>
-              <w:t xml:space="preserve">2026-09-21</w:t>
-            </w:r>
-          </w:p>
-        </w:tc>
-      </w:tr>
-    </w:tbl>
     <w:bookmarkEnd w:id="43"/>
-    <w:bookmarkEnd w:id="44"/>
-    <w:sectPr/>
+    <w:sectPr>
+      <w:pgSz w:h="15840" w:w="12240"/>
+      <w:pgMar w:bottom="1008" w:left="1080" w:right="1080" w:top="1008"/>
+    </w:sectPr>
   </w:body>
 </w:document>
 </file>
@@ -6836,29 +6426,51 @@
   <w:style w:default="1" w:styleId="Normal" w:type="paragraph">
     <w:name w:val="Normal"/>
     <w:qFormat/>
+    <w:pPr>
+      <w:spacing w:after="80" w:before="0" w:line="240" w:lineRule="auto"/>
+    </w:pPr>
+    <w:rPr>
+      <w:rFonts w:ascii="Calibri" w:cs="Calibri" w:eastAsia="Calibri" w:hAnsi="Calibri"/>
+      <w:sz w:val="20"/>
+    </w:rPr>
   </w:style>
   <w:style w:styleId="BodyText" w:type="paragraph">
     <w:name w:val="Body Text"/>
     <w:basedOn w:val="Normal"/>
     <w:link w:val="BodyTextChar"/>
     <w:pPr>
-      <w:spacing w:after="180" w:before="180"/>
+      <w:spacing w:after="80" w:before="80" w:line="240" w:lineRule="auto"/>
     </w:pPr>
     <w:qFormat/>
+    <w:rPr>
+      <w:rFonts w:ascii="Calibri" w:cs="Calibri" w:eastAsia="Calibri" w:hAnsi="Calibri"/>
+      <w:sz w:val="20"/>
+    </w:rPr>
   </w:style>
   <w:style w:customStyle="1" w:styleId="FirstParagraph" w:type="paragraph">
     <w:name w:val="First Paragraph"/>
     <w:basedOn w:val="BodyText"/>
     <w:next w:val="BodyText"/>
     <w:qFormat/>
+    <w:pPr>
+      <w:spacing w:after="80" w:before="80" w:line="240" w:lineRule="auto"/>
+    </w:pPr>
+    <w:rPr>
+      <w:rFonts w:ascii="Calibri" w:cs="Calibri" w:eastAsia="Calibri" w:hAnsi="Calibri"/>
+      <w:sz w:val="20"/>
+    </w:rPr>
   </w:style>
   <w:style w:customStyle="1" w:styleId="Compact" w:type="paragraph">
     <w:name w:val="Compact"/>
     <w:basedOn w:val="BodyText"/>
     <w:qFormat/>
     <w:pPr>
-      <w:spacing w:after="36" w:before="36"/>
+      <w:spacing w:after="0" w:before="0"/>
     </w:pPr>
+    <w:rPr>
+      <w:rFonts w:ascii="Calibri" w:cs="Calibri" w:eastAsia="Calibri" w:hAnsi="Calibri"/>
+      <w:sz w:val="18"/>
+    </w:rPr>
   </w:style>
   <w:style w:styleId="Title" w:type="paragraph">
     <w:name w:val="Title"/>
@@ -6868,14 +6480,14 @@
     <w:pPr>
       <w:keepNext/>
       <w:keepLines/>
-      <w:spacing w:after="240" w:before="480"/>
+      <w:spacing w:after="120" w:before="0"/>
       <w:jc w:val="center"/>
     </w:pPr>
     <w:rPr>
-      <w:rFonts w:asciiTheme="majorHAnsi" w:cstheme="majorBidi" w:eastAsiaTheme="majorEastAsia" w:hAnsiTheme="majorHAnsi"/>
+      <w:rFonts w:ascii="Calibri" w:cs="Calibri" w:eastAsia="Calibri" w:hAnsi="Calibri"/>
       <w:b/>
       <w:bCs/>
-      <w:color w:themeColor="accent1" w:themeShade="B5" w:val="345A8A"/>
+      <w:color w:val="1F3864"/>
       <w:sz w:val="36"/>
       <w:szCs w:val="36"/>
     </w:rPr>
@@ -7154,9 +6766,13 @@
     <w:unhideWhenUsed/>
     <w:qFormat/>
     <w:pPr>
-      <w:spacing w:after="100" w:before="100"/>
+      <w:spacing w:after="80" w:before="40"/>
       <w:ind w:firstLine="0" w:left="480" w:right="480"/>
     </w:pPr>
+    <w:rPr>
+      <w:rFonts w:ascii="Calibri" w:cs="Calibri" w:eastAsia="Calibri" w:hAnsi="Calibri"/>
+      <w:sz w:val="20"/>
+    </w:rPr>
   </w:style>
   <w:style w:styleId="FootnoteText" w:type="paragraph">
     <w:name w:val="Footnote Text"/>
@@ -7179,26 +6795,27 @@
     <w:qFormat/>
     <w:tblPr>
       <w:tblInd w:type="dxa" w:w="0"/>
+      <w:tblBorders>
+        <w:top w:color="A6A6A6" w:space="0" w:sz="4" w:val="single"/>
+        <w:left w:color="A6A6A6" w:space="0" w:sz="4" w:val="single"/>
+        <w:bottom w:color="A6A6A6" w:space="0" w:sz="4" w:val="single"/>
+        <w:right w:color="A6A6A6" w:space="0" w:sz="4" w:val="single"/>
+        <w:insideH w:color="A6A6A6" w:space="0" w:sz="4" w:val="single"/>
+        <w:insideV w:color="A6A6A6" w:space="0" w:sz="4" w:val="single"/>
+      </w:tblBorders>
       <w:tblCellMar>
-        <w:top w:type="dxa" w:w="0"/>
-        <w:left w:type="dxa" w:w="108"/>
-        <w:bottom w:type="dxa" w:w="0"/>
-        <w:right w:type="dxa" w:w="108"/>
+        <w:top w:type="dxa" w:w="20"/>
+        <w:left w:type="dxa" w:w="70"/>
+        <w:bottom w:type="dxa" w:w="20"/>
+        <w:right w:type="dxa" w:w="70"/>
       </w:tblCellMar>
     </w:tblPr>
     <w:tblStylePr w:type="firstRow">
-      <w:tblPr>
-        <w:jc w:val="left"/>
-        <w:tblInd w:type="dxa" w:w="0"/>
-      </w:tblPr>
-      <w:trPr>
-        <w:jc w:val="left"/>
-      </w:trPr>
+      <w:rPr>
+        <w:b/>
+      </w:rPr>
       <w:tcPr>
-        <w:vAlign w:val="bottom"/>
-        <w:tcBorders>
-          <w:bottom w:val="single"/>
-        </w:tcBorders>
+        <w:shd w:color="auto" w:fill="DCE6F2" w:val="clear"/>
       </w:tcPr>
     </w:tblStylePr>
   </w:style>

</xml_diff>